<commit_message>
p-v curves and reports modules 033 034 038
</commit_message>
<xml_diff>
--- a/Analog-Signal-Components/PAX/PAM-2025/PAM-modules/detector-module/detector-module-v2/Jan26_production/module0xx_report.docx
+++ b/Analog-Signal-Components/PAX/PAM-2025/PAM-modules/detector-module/detector-module-v2/Jan26_production/module0xx_report.docx
@@ -72,13 +72,13 @@
         <w:t xml:space="preserve">Built and tested </w:t>
       </w:r>
       <w:r>
-        <w:t>MONTH</w:t>
+        <w:t>March</w:t>
       </w:r>
       <w:r>
         <w:t xml:space="preserve"> 2026 by </w:t>
       </w:r>
       <w:r>
-        <w:t>PEOPLE</w:t>
+        <w:t>Jay Frothingham and Colin Rush</w:t>
       </w:r>
     </w:p>
     <w:p/>
@@ -531,7 +531,7 @@
           <w:noProof/>
         </w:rPr>
         <w:drawing>
-          <wp:anchor distT="0" distB="0" distL="114300" distR="114300" simplePos="0" relativeHeight="251664384" behindDoc="0" locked="0" layoutInCell="1" allowOverlap="1" wp14:anchorId="6F775B1C" wp14:editId="30F34C7D">
+          <wp:anchor distT="0" distB="0" distL="114300" distR="114300" simplePos="0" relativeHeight="251664384" behindDoc="0" locked="0" layoutInCell="1" allowOverlap="1" wp14:anchorId="6F775B1C" wp14:editId="396FC92F">
             <wp:simplePos x="0" y="0"/>
             <wp:positionH relativeFrom="column">
               <wp:posOffset>4008491</wp:posOffset>
@@ -1018,7 +1018,7 @@
           <w:szCs w:val="28"/>
         </w:rPr>
         <w:drawing>
-          <wp:anchor distT="0" distB="0" distL="114300" distR="114300" simplePos="0" relativeHeight="251666432" behindDoc="1" locked="0" layoutInCell="1" allowOverlap="1" wp14:anchorId="7B5D8638" wp14:editId="3A859008">
+          <wp:anchor distT="0" distB="0" distL="114300" distR="114300" simplePos="0" relativeHeight="251666432" behindDoc="1" locked="0" layoutInCell="1" allowOverlap="1" wp14:anchorId="7B5D8638" wp14:editId="428D151D">
             <wp:simplePos x="0" y="0"/>
             <wp:positionH relativeFrom="column">
               <wp:posOffset>4004310</wp:posOffset>

</xml_diff>

<commit_message>
p-v curves and test reports
</commit_message>
<xml_diff>
--- a/Analog-Signal-Components/PAX/PAM-2025/PAM-modules/detector-module/detector-module-v2/Jan26_production/module0xx_report.docx
+++ b/Analog-Signal-Components/PAX/PAM-2025/PAM-modules/detector-module/detector-module-v2/Jan26_production/module0xx_report.docx
@@ -27,7 +27,7 @@
           <w:sz w:val="32"/>
           <w:szCs w:val="32"/>
         </w:rPr>
-        <w:t>xx</w:t>
+        <w:t>40</w:t>
       </w:r>
       <w:r>
         <w:rPr>
@@ -81,7 +81,6 @@
         <w:t>Jay Frothingham and Colin Rush</w:t>
       </w:r>
     </w:p>
-    <w:p/>
     <w:p>
       <w:pPr>
         <w:tabs>
@@ -106,7 +105,7 @@
     </w:p>
     <w:p>
       <w:r>
-        <w:t>NOTES</w:t>
+        <w:t>Impedance mismatch at low frequencies. Needs rework?</w:t>
       </w:r>
     </w:p>
     <w:p/>
@@ -206,7 +205,54 @@
         </w:tabs>
       </w:pPr>
       <w:r>
-        <w:t>IMAGE</w:t>
+        <w:t>First build P-V curve</w:t>
+      </w:r>
+    </w:p>
+    <w:p>
+      <w:pPr>
+        <w:tabs>
+          <w:tab w:val="left" w:pos="4860"/>
+        </w:tabs>
+      </w:pPr>
+      <w:r>
+        <w:rPr>
+          <w:noProof/>
+        </w:rPr>
+        <w:drawing>
+          <wp:inline distT="0" distB="0" distL="0" distR="0" wp14:anchorId="71F3E9D5" wp14:editId="7B5A0303">
+            <wp:extent cx="5972810" cy="4778375"/>
+            <wp:effectExtent l="0" t="0" r="0" b="0"/>
+            <wp:docPr id="2040689387" name="Picture 1"/>
+            <wp:cNvGraphicFramePr>
+              <a:graphicFrameLocks xmlns:a="http://schemas.openxmlformats.org/drawingml/2006/main" noChangeAspect="1"/>
+            </wp:cNvGraphicFramePr>
+            <a:graphic xmlns:a="http://schemas.openxmlformats.org/drawingml/2006/main">
+              <a:graphicData uri="http://schemas.openxmlformats.org/drawingml/2006/picture">
+                <pic:pic xmlns:pic="http://schemas.openxmlformats.org/drawingml/2006/picture">
+                  <pic:nvPicPr>
+                    <pic:cNvPr id="2040689387" name="Picture 2040689387"/>
+                    <pic:cNvPicPr/>
+                  </pic:nvPicPr>
+                  <pic:blipFill>
+                    <a:blip r:embed="rId5"/>
+                    <a:stretch>
+                      <a:fillRect/>
+                    </a:stretch>
+                  </pic:blipFill>
+                  <pic:spPr>
+                    <a:xfrm>
+                      <a:off x="0" y="0"/>
+                      <a:ext cx="5972810" cy="4778375"/>
+                    </a:xfrm>
+                    <a:prstGeom prst="rect">
+                      <a:avLst/>
+                    </a:prstGeom>
+                  </pic:spPr>
+                </pic:pic>
+              </a:graphicData>
+            </a:graphic>
+          </wp:inline>
+        </w:drawing>
       </w:r>
     </w:p>
     <w:p>
@@ -337,7 +383,7 @@
                     <pic:cNvPicPr/>
                   </pic:nvPicPr>
                   <pic:blipFill>
-                    <a:blip r:embed="rId5" cstate="print">
+                    <a:blip r:embed="rId6" cstate="print">
                       <a:extLst>
                         <a:ext uri="{28A0092B-C50C-407E-A947-70E740481C1C}">
                           <a14:useLocalDpi xmlns:a14="http://schemas.microsoft.com/office/drawing/2010/main" val="0"/>
@@ -531,7 +577,7 @@
           <w:noProof/>
         </w:rPr>
         <w:drawing>
-          <wp:anchor distT="0" distB="0" distL="114300" distR="114300" simplePos="0" relativeHeight="251664384" behindDoc="0" locked="0" layoutInCell="1" allowOverlap="1" wp14:anchorId="6F775B1C" wp14:editId="396FC92F">
+          <wp:anchor distT="0" distB="0" distL="114300" distR="114300" simplePos="0" relativeHeight="251664384" behindDoc="0" locked="0" layoutInCell="1" allowOverlap="1" wp14:anchorId="6F775B1C" wp14:editId="4CC1B76A">
             <wp:simplePos x="0" y="0"/>
             <wp:positionH relativeFrom="column">
               <wp:posOffset>4008491</wp:posOffset>
@@ -554,7 +600,7 @@
                     <pic:cNvPicPr/>
                   </pic:nvPicPr>
                   <pic:blipFill>
-                    <a:blip r:embed="rId6" cstate="print">
+                    <a:blip r:embed="rId7" cstate="print">
                       <a:extLst>
                         <a:ext uri="{28A0092B-C50C-407E-A947-70E740481C1C}">
                           <a14:useLocalDpi xmlns:a14="http://schemas.microsoft.com/office/drawing/2010/main" val="0"/>
@@ -1018,7 +1064,7 @@
           <w:szCs w:val="28"/>
         </w:rPr>
         <w:drawing>
-          <wp:anchor distT="0" distB="0" distL="114300" distR="114300" simplePos="0" relativeHeight="251666432" behindDoc="1" locked="0" layoutInCell="1" allowOverlap="1" wp14:anchorId="7B5D8638" wp14:editId="428D151D">
+          <wp:anchor distT="0" distB="0" distL="114300" distR="114300" simplePos="0" relativeHeight="251666432" behindDoc="1" locked="0" layoutInCell="1" allowOverlap="1" wp14:anchorId="7B5D8638" wp14:editId="6661B09F">
             <wp:simplePos x="0" y="0"/>
             <wp:positionH relativeFrom="column">
               <wp:posOffset>4004310</wp:posOffset>
@@ -1041,7 +1087,7 @@
                     <pic:cNvPicPr/>
                   </pic:nvPicPr>
                   <pic:blipFill>
-                    <a:blip r:embed="rId7" cstate="print">
+                    <a:blip r:embed="rId8" cstate="print">
                       <a:extLst>
                         <a:ext uri="{28A0092B-C50C-407E-A947-70E740481C1C}">
                           <a14:useLocalDpi xmlns:a14="http://schemas.microsoft.com/office/drawing/2010/main" val="0"/>

</xml_diff>

<commit_message>
p-v curves and test reports, 10 modules
</commit_message>
<xml_diff>
--- a/Analog-Signal-Components/PAX/PAM-2025/PAM-modules/detector-module/detector-module-v2/Jan26_production/module0xx_report.docx
+++ b/Analog-Signal-Components/PAX/PAM-2025/PAM-modules/detector-module/detector-module-v2/Jan26_production/module0xx_report.docx
@@ -27,7 +27,7 @@
           <w:sz w:val="32"/>
           <w:szCs w:val="32"/>
         </w:rPr>
-        <w:t>40</w:t>
+        <w:t>xx</w:t>
       </w:r>
       <w:r>
         <w:rPr>
@@ -107,6 +107,9 @@
       <w:r>
         <w:t>Impedance mismatch at low frequencies. Needs rework?</w:t>
       </w:r>
+      <w:r>
+        <w:t xml:space="preserve"> OR N/A OR [other problem]</w:t>
+      </w:r>
     </w:p>
     <w:p/>
     <w:p>
@@ -214,46 +217,6 @@
           <w:tab w:val="left" w:pos="4860"/>
         </w:tabs>
       </w:pPr>
-      <w:r>
-        <w:rPr>
-          <w:noProof/>
-        </w:rPr>
-        <w:drawing>
-          <wp:inline distT="0" distB="0" distL="0" distR="0" wp14:anchorId="71F3E9D5" wp14:editId="7B5A0303">
-            <wp:extent cx="5972810" cy="4778375"/>
-            <wp:effectExtent l="0" t="0" r="0" b="0"/>
-            <wp:docPr id="2040689387" name="Picture 1"/>
-            <wp:cNvGraphicFramePr>
-              <a:graphicFrameLocks xmlns:a="http://schemas.openxmlformats.org/drawingml/2006/main" noChangeAspect="1"/>
-            </wp:cNvGraphicFramePr>
-            <a:graphic xmlns:a="http://schemas.openxmlformats.org/drawingml/2006/main">
-              <a:graphicData uri="http://schemas.openxmlformats.org/drawingml/2006/picture">
-                <pic:pic xmlns:pic="http://schemas.openxmlformats.org/drawingml/2006/picture">
-                  <pic:nvPicPr>
-                    <pic:cNvPr id="2040689387" name="Picture 2040689387"/>
-                    <pic:cNvPicPr/>
-                  </pic:nvPicPr>
-                  <pic:blipFill>
-                    <a:blip r:embed="rId5"/>
-                    <a:stretch>
-                      <a:fillRect/>
-                    </a:stretch>
-                  </pic:blipFill>
-                  <pic:spPr>
-                    <a:xfrm>
-                      <a:off x="0" y="0"/>
-                      <a:ext cx="5972810" cy="4778375"/>
-                    </a:xfrm>
-                    <a:prstGeom prst="rect">
-                      <a:avLst/>
-                    </a:prstGeom>
-                  </pic:spPr>
-                </pic:pic>
-              </a:graphicData>
-            </a:graphic>
-          </wp:inline>
-        </w:drawing>
-      </w:r>
     </w:p>
     <w:p>
       <w:pPr>
@@ -308,7 +271,7 @@
       </w:r>
       <w:bookmarkEnd w:id="0"/>
       <w:r>
-        <w:t xml:space="preserve"> 000.</w:t>
+        <w:t>.</w:t>
       </w:r>
     </w:p>
     <w:p>
@@ -383,7 +346,7 @@
                     <pic:cNvPicPr/>
                   </pic:nvPicPr>
                   <pic:blipFill>
-                    <a:blip r:embed="rId6" cstate="print">
+                    <a:blip r:embed="rId5" cstate="print">
                       <a:extLst>
                         <a:ext uri="{28A0092B-C50C-407E-A947-70E740481C1C}">
                           <a14:useLocalDpi xmlns:a14="http://schemas.microsoft.com/office/drawing/2010/main" val="0"/>
@@ -577,7 +540,7 @@
           <w:noProof/>
         </w:rPr>
         <w:drawing>
-          <wp:anchor distT="0" distB="0" distL="114300" distR="114300" simplePos="0" relativeHeight="251664384" behindDoc="0" locked="0" layoutInCell="1" allowOverlap="1" wp14:anchorId="6F775B1C" wp14:editId="4CC1B76A">
+          <wp:anchor distT="0" distB="0" distL="114300" distR="114300" simplePos="0" relativeHeight="251664384" behindDoc="0" locked="0" layoutInCell="1" allowOverlap="1" wp14:anchorId="6F775B1C" wp14:editId="30F665F6">
             <wp:simplePos x="0" y="0"/>
             <wp:positionH relativeFrom="column">
               <wp:posOffset>4008491</wp:posOffset>
@@ -600,7 +563,7 @@
                     <pic:cNvPicPr/>
                   </pic:nvPicPr>
                   <pic:blipFill>
-                    <a:blip r:embed="rId7" cstate="print">
+                    <a:blip r:embed="rId6" cstate="print">
                       <a:extLst>
                         <a:ext uri="{28A0092B-C50C-407E-A947-70E740481C1C}">
                           <a14:useLocalDpi xmlns:a14="http://schemas.microsoft.com/office/drawing/2010/main" val="0"/>
@@ -1064,7 +1027,7 @@
           <w:szCs w:val="28"/>
         </w:rPr>
         <w:drawing>
-          <wp:anchor distT="0" distB="0" distL="114300" distR="114300" simplePos="0" relativeHeight="251666432" behindDoc="1" locked="0" layoutInCell="1" allowOverlap="1" wp14:anchorId="7B5D8638" wp14:editId="6661B09F">
+          <wp:anchor distT="0" distB="0" distL="114300" distR="114300" simplePos="0" relativeHeight="251666432" behindDoc="1" locked="0" layoutInCell="1" allowOverlap="1" wp14:anchorId="7B5D8638" wp14:editId="0053FBFA">
             <wp:simplePos x="0" y="0"/>
             <wp:positionH relativeFrom="column">
               <wp:posOffset>4004310</wp:posOffset>
@@ -1087,7 +1050,7 @@
                     <pic:cNvPicPr/>
                   </pic:nvPicPr>
                   <pic:blipFill>
-                    <a:blip r:embed="rId8" cstate="print">
+                    <a:blip r:embed="rId7" cstate="print">
                       <a:extLst>
                         <a:ext uri="{28A0092B-C50C-407E-A947-70E740481C1C}">
                           <a14:useLocalDpi xmlns:a14="http://schemas.microsoft.com/office/drawing/2010/main" val="0"/>

</xml_diff>